<commit_message>
A7 Unit 5 reviewed before shipping (Barton, adversarial, FAST educator — audit §8): the Q8 transfer surface pulled off the review and the 5.10 set; per-form key notes; Q3 and Q10 as FAST multiselects with the B1G-M misconceptions as choices; Q14 across systems; 'tanks the trip uses'; 5.04 teaches the scale from one pair before the exit asks it; US spellings; standard notes as the state writes them; kit prints Variation in the lines TE. 0 findings, installed, sheet 0 problems
Co-Authored-By: Claude Fable 5.1 <noreply@anthropic.com>
Claude-Session: https://claude.ai/code/session_01B7ovt6yLjh6QuFV9HBMV4N
</commit_message>
<xml_diff>
--- a/a7/build/out/u5/A7 5.01 Scale Drawings - Lesson Plan.docx
+++ b/a7/build/out/u5/A7 5.01 Scale Drawings - Lesson Plan.docx
@@ -3699,7 +3699,7 @@
                 <w:color w:val="1A1A1A"/>
                 <w:sz w:val="18"/>
               </w:rPr>
-              <w:t>⅓ — divided original by copy [B1G-M 7.GR.1.5: the proportion set up backwards]; 4 — subtracted [the additive error]</w:t>
+              <w:t>⅓ — divided original by copy [B1G-M 7.GR.1.5: the proportion set up backwards]; 4 — subtracted [7.GR.1.5: the additive error — Math Nation's named misconception]</w:t>
             </w:r>
           </w:p>
         </w:tc>
@@ -3957,7 +3957,7 @@
                 <w:color w:val="1A1A1A"/>
                 <w:sz w:val="18"/>
               </w:rPr>
-              <w:t>1⅓ — original ÷ copy [7.GR.1.5]; 3 — subtracted [the additive error]</w:t>
+              <w:t>1⅓ — original ÷ copy [7.GR.1.5]; 3 — subtracted [7.GR.1.5: the additive error — Math Nation's named misconception]</w:t>
             </w:r>
           </w:p>
         </w:tc>
@@ -4344,7 +4344,7 @@
                 <w:color w:val="1A1A1A"/>
                 <w:sz w:val="18"/>
               </w:rPr>
-              <w:t>(B) 40 + 2.5: the additive error [B1G-M]; (C) 40 ÷ 2.5: the angle divided [7.GR.1.5]; (D) 40 × 2.5: the angle scaled like a length [7.GR.1.5: a scale factor multiplies lengths; the shape — its angles — is what stays the same]</w:t>
+              <w:t>(B) 40 + 2.5: the additive error [7.GR.1.5: Math Nation's named misconception]; (C) 40 ÷ 2.5: the angle divided [7.GR.1.5]; (D) 40 × 2.5: the angle scaled like a length [7.GR.1.5: a scale factor multiplies lengths; the shape — its angles — is what stays the same]</w:t>
             </w:r>
           </w:p>
         </w:tc>
@@ -4540,7 +4540,7 @@
                 <w:color w:val="1A1A1A"/>
                 <w:sz w:val="18"/>
               </w:rPr>
-              <w:t>Dev, who is 13, draws a 12-ft wall as 3 in long.  How long is a 20-ft wall on his drawing?</w:t>
+              <w:t>Dev, who is 13, draws a 15-ft wall as 3 in long.  How long is a 20-ft wall on his drawing?</w:t>
             </w:r>
           </w:p>
         </w:tc>
@@ -4571,7 +4571,7 @@
                 <w:color w:val="9E1B32"/>
                 <w:sz w:val="18"/>
               </w:rPr>
-              <w:t>5 in</w:t>
+              <w:t>4 in</w:t>
             </w:r>
           </w:p>
         </w:tc>
@@ -4602,7 +4602,7 @@
                 <w:color w:val="1A1A1A"/>
                 <w:sz w:val="18"/>
               </w:rPr>
-              <w:t>80 — multiplied by 4 going to the drawing [Notes III: back to the drawing, divide]; 11 — 20 − 12 + 3, the additive error</w:t>
+              <w:t>100 — multiplied by 5 going to the drawing [Notes III: back to the drawing, divide]; 8 — 20 − 15 + 3, the additive error</w:t>
             </w:r>
           </w:p>
         </w:tc>

</xml_diff>